<commit_message>
Update Unsex Me Here- Language, Power, and the Making of Lady Macbeth.docx
</commit_message>
<xml_diff>
--- a/Unsex Me Here- Language, Power, and the Making of Lady Macbeth.docx
+++ b/Unsex Me Here- Language, Power, and the Making of Lady Macbeth.docx
@@ -18,24 +18,17 @@
     </w:p>
     <w:p>
       <w:pPr>
-        <w:spacing w:before="1440" w:after="120"/>
+        <w:spacing w:after="200"/>
         <w:jc w:val="center"/>
-        <w:rPr>
-          <w:rFonts w:ascii="Times New Roman" w:hAnsi="Times New Roman" w:cs="Times New Roman"/>
-          <w:color w:val="000000" w:themeColor="text1"/>
-        </w:rPr>
-      </w:pPr>
-      <w:r>
         <w:rPr>
           <w:rFonts w:ascii="Times New Roman" w:hAnsi="Times New Roman" w:cs="Times New Roman"/>
           <w:b/>
           <w:bCs/>
           <w:color w:val="000000" w:themeColor="text1"/>
-          <w:sz w:val="52"/>
-          <w:szCs w:val="52"/>
-        </w:rPr>
-        <w:t>Commanding Silence:</w:t>
-      </w:r>
+          <w:sz w:val="48"/>
+          <w:szCs w:val="48"/>
+        </w:rPr>
+      </w:pPr>
     </w:p>
     <w:p>
       <w:pPr>
@@ -43,20 +36,13 @@
         <w:jc w:val="center"/>
         <w:rPr>
           <w:rFonts w:ascii="Times New Roman" w:hAnsi="Times New Roman" w:cs="Times New Roman"/>
+          <w:b/>
+          <w:bCs/>
           <w:color w:val="000000" w:themeColor="text1"/>
-          <w:sz w:val="36"/>
-          <w:szCs w:val="36"/>
-        </w:rPr>
-      </w:pPr>
-      <w:r>
-        <w:rPr>
-          <w:rFonts w:ascii="Times New Roman" w:hAnsi="Times New Roman" w:cs="Times New Roman"/>
-          <w:color w:val="000000" w:themeColor="text1"/>
-          <w:sz w:val="36"/>
-          <w:szCs w:val="36"/>
-        </w:rPr>
-        <w:t>Power, Directive Speech, and Gendered Language in Lady Macbeth</w:t>
-      </w:r>
+          <w:sz w:val="48"/>
+          <w:szCs w:val="48"/>
+        </w:rPr>
+      </w:pPr>
     </w:p>
     <w:p>
       <w:pPr>
@@ -65,36 +51,29 @@
         <w:rPr>
           <w:rFonts w:ascii="Times New Roman" w:hAnsi="Times New Roman" w:cs="Times New Roman"/>
           <w:color w:val="000000" w:themeColor="text1"/>
-          <w:sz w:val="20"/>
-          <w:szCs w:val="20"/>
-        </w:rPr>
-      </w:pPr>
-      <w:r>
-        <w:rPr>
-          <w:rFonts w:ascii="Times New Roman" w:hAnsi="Times New Roman" w:cs="Times New Roman"/>
+          <w:sz w:val="32"/>
+          <w:szCs w:val="32"/>
+        </w:rPr>
+      </w:pPr>
+      <w:r>
+        <w:rPr>
+          <w:rFonts w:ascii="Times New Roman" w:hAnsi="Times New Roman" w:cs="Times New Roman"/>
+          <w:i/>
+          <w:iCs/>
           <w:color w:val="000000" w:themeColor="text1"/>
-          <w:sz w:val="28"/>
-          <w:szCs w:val="28"/>
-        </w:rPr>
-        <w:t xml:space="preserve">- </w:t>
+          <w:sz w:val="32"/>
+          <w:szCs w:val="32"/>
+        </w:rPr>
+        <w:t>Unsex Me Here</w:t>
       </w:r>
       <w:r>
         <w:rPr>
           <w:rFonts w:ascii="Times New Roman" w:hAnsi="Times New Roman" w:cs="Times New Roman"/>
           <w:color w:val="000000" w:themeColor="text1"/>
-          <w:sz w:val="28"/>
-          <w:szCs w:val="28"/>
-        </w:rPr>
-        <w:t>Jimena Sánchez Curto</w:t>
-      </w:r>
-      <w:r>
-        <w:rPr>
-          <w:rFonts w:ascii="Times New Roman" w:hAnsi="Times New Roman" w:cs="Times New Roman"/>
-          <w:color w:val="000000" w:themeColor="text1"/>
-          <w:sz w:val="28"/>
-          <w:szCs w:val="28"/>
-        </w:rPr>
-        <w:t xml:space="preserve"> - </w:t>
+          <w:sz w:val="32"/>
+          <w:szCs w:val="32"/>
+        </w:rPr>
+        <w:t>: Language, Power and the Making of Lady Macbeth</w:t>
       </w:r>
     </w:p>
     <w:p>
@@ -183,17 +162,62 @@
         <w:jc w:val="center"/>
         <w:rPr>
           <w:rFonts w:ascii="Times New Roman" w:hAnsi="Times New Roman" w:cs="Times New Roman"/>
-        </w:rPr>
-      </w:pPr>
-      <w:r>
-        <w:rPr>
-          <w:rFonts w:ascii="Times New Roman" w:hAnsi="Times New Roman" w:cs="Times New Roman"/>
           <w:color w:val="6B7280"/>
           <w:sz w:val="20"/>
           <w:szCs w:val="20"/>
         </w:rPr>
+      </w:pPr>
+      <w:r>
+        <w:rPr>
+          <w:rFonts w:ascii="Times New Roman" w:hAnsi="Times New Roman" w:cs="Times New Roman"/>
+          <w:color w:val="6B7280"/>
+          <w:sz w:val="20"/>
+          <w:szCs w:val="20"/>
+        </w:rPr>
         <w:t>Discipline: Digital Humanities / Corpus Linguistics / Computational Literary Studies</w:t>
       </w:r>
+    </w:p>
+    <w:p>
+      <w:pPr>
+        <w:spacing w:after="200"/>
+        <w:jc w:val="center"/>
+        <w:rPr>
+          <w:rFonts w:ascii="Times New Roman" w:hAnsi="Times New Roman" w:cs="Times New Roman"/>
+          <w:color w:val="000000" w:themeColor="text1"/>
+          <w:sz w:val="28"/>
+          <w:szCs w:val="28"/>
+        </w:rPr>
+      </w:pPr>
+    </w:p>
+    <w:p>
+      <w:pPr>
+        <w:spacing w:after="200"/>
+        <w:jc w:val="center"/>
+        <w:rPr>
+          <w:rFonts w:ascii="Times New Roman" w:hAnsi="Times New Roman" w:cs="Times New Roman"/>
+          <w:color w:val="000000" w:themeColor="text1"/>
+          <w:sz w:val="18"/>
+          <w:szCs w:val="18"/>
+        </w:rPr>
+      </w:pPr>
+      <w:r>
+        <w:rPr>
+          <w:rFonts w:ascii="Times New Roman" w:hAnsi="Times New Roman" w:cs="Times New Roman"/>
+          <w:color w:val="000000" w:themeColor="text1"/>
+          <w:sz w:val="24"/>
+          <w:szCs w:val="24"/>
+        </w:rPr>
+        <w:t>Jimena Sánchez Curto</w:t>
+      </w:r>
+    </w:p>
+    <w:p>
+      <w:pPr>
+        <w:spacing w:before="80" w:after="80"/>
+        <w:jc w:val="center"/>
+        <w:rPr>
+          <w:rFonts w:ascii="Times New Roman" w:hAnsi="Times New Roman" w:cs="Times New Roman"/>
+        </w:rPr>
+      </w:pPr>
     </w:p>
     <w:p/>
     <w:p/>
@@ -328,12 +352,22 @@
         <w:rPr>
           <w:rFonts w:ascii="Times New Roman" w:hAnsi="Times New Roman" w:cs="Times New Roman"/>
         </w:rPr>
-        <w:t xml:space="preserve">Few speeches in the English dramatic canon are as celebrated for their linguistic violence as Lady Macbeth's invocation in Act I, Scene v: 'Come, you </w:t>
+        <w:t xml:space="preserve">Few speeches in the English dramatic canon are as celebrated for their linguistic violence as Lady Macbeth's invocation in Act I, Scene v: </w:t>
+      </w:r>
+      <w:r>
+        <w:rPr>
+          <w:rFonts w:ascii="Times New Roman" w:hAnsi="Times New Roman" w:cs="Times New Roman"/>
+          <w:i/>
+          <w:iCs/>
+        </w:rPr>
+        <w:t xml:space="preserve">'Come, you </w:t>
       </w:r>
       <w:proofErr w:type="gramStart"/>
       <w:r>
         <w:rPr>
           <w:rFonts w:ascii="Times New Roman" w:hAnsi="Times New Roman" w:cs="Times New Roman"/>
+          <w:i/>
+          <w:iCs/>
         </w:rPr>
         <w:t>spirits</w:t>
       </w:r>
@@ -341,8 +375,16 @@
       <w:r>
         <w:rPr>
           <w:rFonts w:ascii="Times New Roman" w:hAnsi="Times New Roman" w:cs="Times New Roman"/>
-        </w:rPr>
-        <w:t xml:space="preserve"> / That tend on mortal thoughts, unsex me here.' The lines have been read as a claim to masculine authority, a rejection of biological femininity, a petition to supernatural forces, and a performative act of self-reinvention. Critics from Coleridge onwards have noted the commanding register of Lady Macbeth's early scenes and contrasted it with her psychological dissolution in Act V. What has received less attention is whether that commanding register is quantitatively distinctive — whether it is linguistically real in ways that corpus analysis can recover — and whether it is unusual relative to the other female characters the play provides for comparison.</w:t>
+          <w:i/>
+          <w:iCs/>
+        </w:rPr>
+        <w:t xml:space="preserve"> / That tend on mortal thoughts, unsex me here.</w:t>
+      </w:r>
+      <w:r>
+        <w:rPr>
+          <w:rFonts w:ascii="Times New Roman" w:hAnsi="Times New Roman" w:cs="Times New Roman"/>
+        </w:rPr>
+        <w:t>' The lines have been read as a claim to masculine authority, a rejection of biological femininity, a petition to supernatural forces, and a performative act of self-reinvention. Critics from Coleridge onwards have noted the commanding register of Lady Macbeth's early scenes and contrasted it with her psychological dissolution in Act V. What has received less attention is whether that commanding register is quantitatively distinctive — whether it is linguistically real in ways that corpus analysis can recover — and whether it is unusual relative to the other female characters the play provides for comparison.</w:t>
       </w:r>
     </w:p>
     <w:p>
@@ -3359,57 +3401,206 @@
         <w:spacing w:before="160" w:after="160"/>
         <w:jc w:val="center"/>
         <w:rPr>
-          <w:rFonts w:ascii="Times New Roman" w:hAnsi="Times New Roman" w:cs="Times New Roman"/>
-        </w:rPr>
-      </w:pPr>
-      <w:r>
-        <w:rPr>
           <w:rFonts w:ascii="Times New Roman" w:eastAsia="Courier New" w:hAnsi="Times New Roman" w:cs="Times New Roman"/>
         </w:rPr>
-        <w:t>log(E[</w:t>
-      </w:r>
-      <w:proofErr w:type="spellStart"/>
-      <w:r>
-        <w:rPr>
-          <w:rFonts w:ascii="Times New Roman" w:eastAsia="Courier New" w:hAnsi="Times New Roman" w:cs="Times New Roman"/>
-        </w:rPr>
-        <w:t>imperative_count</w:t>
-      </w:r>
-      <w:proofErr w:type="spellEnd"/>
-      <w:r>
-        <w:rPr>
-          <w:rFonts w:ascii="Times New Roman" w:eastAsia="Courier New" w:hAnsi="Times New Roman" w:cs="Times New Roman"/>
-        </w:rPr>
-        <w:t xml:space="preserve">]) = β₀ + β₁ × </w:t>
-      </w:r>
-      <w:proofErr w:type="spellStart"/>
-      <w:r>
-        <w:rPr>
-          <w:rFonts w:ascii="Times New Roman" w:eastAsia="Courier New" w:hAnsi="Times New Roman" w:cs="Times New Roman"/>
-        </w:rPr>
-        <w:t>phase_num</w:t>
-      </w:r>
-      <w:proofErr w:type="spellEnd"/>
-      <w:r>
-        <w:rPr>
-          <w:rFonts w:ascii="Times New Roman" w:eastAsia="Courier New" w:hAnsi="Times New Roman" w:cs="Times New Roman"/>
-        </w:rPr>
-        <w:t xml:space="preserve"> + log(</w:t>
-      </w:r>
-      <w:proofErr w:type="spellStart"/>
-      <w:r>
-        <w:rPr>
-          <w:rFonts w:ascii="Times New Roman" w:eastAsia="Courier New" w:hAnsi="Times New Roman" w:cs="Times New Roman"/>
-        </w:rPr>
-        <w:t>word_count</w:t>
-      </w:r>
-      <w:proofErr w:type="spellEnd"/>
-      <w:r>
-        <w:rPr>
-          <w:rFonts w:ascii="Times New Roman" w:eastAsia="Courier New" w:hAnsi="Times New Roman" w:cs="Times New Roman"/>
-        </w:rPr>
-        <w:t>)</w:t>
-      </w:r>
+      </w:pPr>
+      <m:oMathPara>
+        <m:oMath>
+          <m:func>
+            <m:funcPr>
+              <m:ctrlPr>
+                <w:rPr>
+                  <w:rFonts w:ascii="Cambria Math" w:eastAsia="Courier New" w:hAnsi="Cambria Math" w:cs="Times New Roman"/>
+                  <w:i/>
+                </w:rPr>
+              </m:ctrlPr>
+            </m:funcPr>
+            <m:fName>
+              <m:r>
+                <m:rPr>
+                  <m:sty m:val="p"/>
+                </m:rPr>
+                <w:rPr>
+                  <w:rFonts w:ascii="Cambria Math" w:eastAsia="Courier New" w:hAnsi="Cambria Math" w:cs="Times New Roman"/>
+                </w:rPr>
+                <m:t>log</m:t>
+              </m:r>
+            </m:fName>
+            <m:e>
+              <m:d>
+                <m:dPr>
+                  <m:ctrlPr>
+                    <w:rPr>
+                      <w:rFonts w:ascii="Cambria Math" w:eastAsia="Courier New" w:hAnsi="Cambria Math" w:cs="Times New Roman"/>
+                      <w:i/>
+                    </w:rPr>
+                  </m:ctrlPr>
+                </m:dPr>
+                <m:e>
+                  <m:r>
+                    <w:rPr>
+                      <w:rFonts w:ascii="Cambria Math" w:eastAsia="Courier New" w:hAnsi="Cambria Math" w:cs="Times New Roman"/>
+                    </w:rPr>
+                    <m:t>E</m:t>
+                  </m:r>
+                  <m:d>
+                    <m:dPr>
+                      <m:begChr m:val="["/>
+                      <m:endChr m:val="]"/>
+                      <m:ctrlPr>
+                        <w:rPr>
+                          <w:rFonts w:ascii="Cambria Math" w:eastAsia="Courier New" w:hAnsi="Cambria Math" w:cs="Times New Roman"/>
+                          <w:i/>
+                        </w:rPr>
+                      </m:ctrlPr>
+                    </m:dPr>
+                    <m:e>
+                      <m:r>
+                        <m:rPr>
+                          <m:nor/>
+                        </m:rPr>
+                        <w:rPr>
+                          <w:rFonts w:ascii="Cambria Math" w:eastAsia="Courier New" w:hAnsi="Cambria Math" w:cs="Times New Roman"/>
+                        </w:rPr>
+                        <m:t>imperative_count</m:t>
+                      </m:r>
+                    </m:e>
+                  </m:d>
+                </m:e>
+              </m:d>
+              <m:r>
+                <w:rPr>
+                  <w:rFonts w:ascii="Cambria Math" w:eastAsia="Courier New" w:hAnsi="Cambria Math" w:cs="Times New Roman"/>
+                </w:rPr>
+                <m:t>=</m:t>
+              </m:r>
+              <m:sSub>
+                <m:sSubPr>
+                  <m:ctrlPr>
+                    <w:rPr>
+                      <w:rFonts w:ascii="Cambria Math" w:eastAsia="Courier New" w:hAnsi="Cambria Math" w:cs="Times New Roman"/>
+                      <w:i/>
+                    </w:rPr>
+                  </m:ctrlPr>
+                </m:sSubPr>
+                <m:e>
+                  <m:r>
+                    <w:rPr>
+                      <w:rFonts w:ascii="Cambria Math" w:eastAsia="Courier New" w:hAnsi="Cambria Math" w:cs="Times New Roman"/>
+                    </w:rPr>
+                    <m:t>β</m:t>
+                  </m:r>
+                </m:e>
+                <m:sub>
+                  <m:r>
+                    <w:rPr>
+                      <w:rFonts w:ascii="Cambria Math" w:eastAsia="Courier New" w:hAnsi="Cambria Math" w:cs="Times New Roman"/>
+                    </w:rPr>
+                    <m:t>0</m:t>
+                  </m:r>
+                </m:sub>
+              </m:sSub>
+              <m:r>
+                <w:rPr>
+                  <w:rFonts w:ascii="Cambria Math" w:eastAsia="Courier New" w:hAnsi="Cambria Math" w:cs="Times New Roman"/>
+                </w:rPr>
+                <m:t>+</m:t>
+              </m:r>
+              <m:sSub>
+                <m:sSubPr>
+                  <m:ctrlPr>
+                    <w:rPr>
+                      <w:rFonts w:ascii="Cambria Math" w:eastAsia="Courier New" w:hAnsi="Cambria Math" w:cs="Times New Roman"/>
+                      <w:i/>
+                    </w:rPr>
+                  </m:ctrlPr>
+                </m:sSubPr>
+                <m:e>
+                  <m:r>
+                    <w:rPr>
+                      <w:rFonts w:ascii="Cambria Math" w:eastAsia="Courier New" w:hAnsi="Cambria Math" w:cs="Times New Roman"/>
+                    </w:rPr>
+                    <m:t>β</m:t>
+                  </m:r>
+                </m:e>
+                <m:sub>
+                  <m:r>
+                    <w:rPr>
+                      <w:rFonts w:ascii="Cambria Math" w:eastAsia="Courier New" w:hAnsi="Cambria Math" w:cs="Times New Roman"/>
+                    </w:rPr>
+                    <m:t>1</m:t>
+                  </m:r>
+                </m:sub>
+              </m:sSub>
+              <m:r>
+                <w:rPr>
+                  <w:rFonts w:ascii="Cambria Math" w:eastAsia="Courier New" w:hAnsi="Cambria Math" w:cs="Times New Roman"/>
+                </w:rPr>
+                <m:t>×</m:t>
+              </m:r>
+              <m:r>
+                <m:rPr>
+                  <m:nor/>
+                </m:rPr>
+                <w:rPr>
+                  <w:rFonts w:ascii="Cambria Math" w:eastAsia="Courier New" w:hAnsi="Cambria Math" w:cs="Times New Roman"/>
+                </w:rPr>
+                <m:t>phase_num</m:t>
+              </m:r>
+              <m:r>
+                <w:rPr>
+                  <w:rFonts w:ascii="Cambria Math" w:eastAsia="Courier New" w:hAnsi="Cambria Math" w:cs="Times New Roman"/>
+                </w:rPr>
+                <m:t>+</m:t>
+              </m:r>
+              <m:func>
+                <m:funcPr>
+                  <m:ctrlPr>
+                    <w:rPr>
+                      <w:rFonts w:ascii="Cambria Math" w:eastAsia="Courier New" w:hAnsi="Cambria Math" w:cs="Times New Roman"/>
+                      <w:i/>
+                    </w:rPr>
+                  </m:ctrlPr>
+                </m:funcPr>
+                <m:fName>
+                  <m:r>
+                    <m:rPr>
+                      <m:sty m:val="p"/>
+                    </m:rPr>
+                    <w:rPr>
+                      <w:rFonts w:ascii="Cambria Math" w:eastAsia="Courier New" w:hAnsi="Cambria Math" w:cs="Times New Roman"/>
+                    </w:rPr>
+                    <m:t>log</m:t>
+                  </m:r>
+                </m:fName>
+                <m:e>
+                  <m:r>
+                    <w:rPr>
+                      <w:rFonts w:ascii="Cambria Math" w:eastAsia="Courier New" w:hAnsi="Cambria Math" w:cs="Times New Roman"/>
+                    </w:rPr>
+                    <m:t>(</m:t>
+                  </m:r>
+                  <m:r>
+                    <m:rPr>
+                      <m:nor/>
+                    </m:rPr>
+                    <w:rPr>
+                      <w:rFonts w:ascii="Cambria Math" w:eastAsia="Courier New" w:hAnsi="Cambria Math" w:cs="Times New Roman"/>
+                    </w:rPr>
+                    <m:t>word_count</m:t>
+                  </m:r>
+                  <m:r>
+                    <w:rPr>
+                      <w:rFonts w:ascii="Cambria Math" w:eastAsia="Courier New" w:hAnsi="Cambria Math" w:cs="Times New Roman"/>
+                    </w:rPr>
+                    <m:t>)</m:t>
+                  </m:r>
+                </m:e>
+              </m:func>
+            </m:e>
+          </m:func>
+        </m:oMath>
+      </m:oMathPara>
     </w:p>
     <w:p>
       <w:pPr>
@@ -4425,14 +4616,12 @@
         </w:rPr>
         <w:t xml:space="preserve">Table 2 presents the imperative counts, word counts, and </w:t>
       </w:r>
-      <w:proofErr w:type="spellStart"/>
-      <w:r>
-        <w:rPr>
-          <w:rFonts w:ascii="Times New Roman" w:hAnsi="Times New Roman" w:cs="Times New Roman"/>
-        </w:rPr>
-        <w:t>normalised</w:t>
-      </w:r>
-      <w:proofErr w:type="spellEnd"/>
+      <w:r>
+        <w:rPr>
+          <w:rFonts w:ascii="Times New Roman" w:hAnsi="Times New Roman" w:cs="Times New Roman"/>
+        </w:rPr>
+        <w:t>normalized</w:t>
+      </w:r>
       <w:r>
         <w:rPr>
           <w:rFonts w:ascii="Times New Roman" w:hAnsi="Times New Roman" w:cs="Times New Roman"/>
@@ -10576,7 +10765,6 @@
                 <w:color w:val="000000" w:themeColor="text1"/>
               </w:rPr>
             </w:pPr>
-            <w:proofErr w:type="spellStart"/>
             <w:r>
               <w:rPr>
                 <w:rFonts w:ascii="Times New Roman" w:hAnsi="Times New Roman" w:cs="Times New Roman"/>
@@ -10588,7 +10776,6 @@
               </w:rPr>
               <w:t>phase_num</w:t>
             </w:r>
-            <w:proofErr w:type="spellEnd"/>
           </w:p>
         </w:tc>
         <w:tc>
@@ -12571,27 +12758,7 @@
                 <w:sz w:val="20"/>
                 <w:szCs w:val="20"/>
               </w:rPr>
-              <w:t>LM/</w:t>
-            </w:r>
-            <w:proofErr w:type="spellStart"/>
-            <w:r>
-              <w:rPr>
-                <w:rFonts w:ascii="Times New Roman" w:hAnsi="Times New Roman" w:cs="Times New Roman"/>
-                <w:color w:val="000000" w:themeColor="text1"/>
-                <w:sz w:val="20"/>
-                <w:szCs w:val="20"/>
-              </w:rPr>
-              <w:t>LMac</w:t>
-            </w:r>
-            <w:proofErr w:type="spellEnd"/>
-            <w:r>
-              <w:rPr>
-                <w:rFonts w:ascii="Times New Roman" w:hAnsi="Times New Roman" w:cs="Times New Roman"/>
-                <w:color w:val="000000" w:themeColor="text1"/>
-                <w:sz w:val="20"/>
-                <w:szCs w:val="20"/>
-              </w:rPr>
-              <w:t xml:space="preserve"> Ratio</w:t>
+              <w:t>LM/LMac Ratio</w:t>
             </w:r>
           </w:p>
         </w:tc>
@@ -15956,6 +16123,7 @@
       <w:pgSz w:w="12240" w:h="15840"/>
       <w:pgMar w:top="1440" w:right="1440" w:bottom="1440" w:left="1440" w:header="708" w:footer="708" w:gutter="0"/>
       <w:cols w:space="720"/>
+      <w:titlePg/>
       <w:docGrid w:linePitch="360"/>
     </w:sectPr>
   </w:body>
@@ -16965,6 +17133,16 @@
       </w:tcPr>
     </w:tblStylePr>
   </w:style>
+  <w:style w:type="character" w:styleId="PlaceholderText">
+    <w:name w:val="Placeholder Text"/>
+    <w:basedOn w:val="DefaultParagraphFont"/>
+    <w:uiPriority w:val="99"/>
+    <w:semiHidden/>
+    <w:rsid w:val="009474CA"/>
+    <w:rPr>
+      <w:color w:val="666666"/>
+    </w:rPr>
+  </w:style>
 </w:styles>
 </file>
 

</xml_diff>